<commit_message>
feat: add student import functionality and validation
- Implemented a new API route for importing students with validation.
- Created functions for normalizing and validating student import rows.
- Added tests for student import validation logic.
- Developed a provisioning function for approved students, handling user creation and application status updates.
- Introduced a leadership section component to display university management.
- Added credential account management for secure password handling.
- Created a script to verify seed data integrity for student accounts.
- Enhanced admin services for student management, including fetching and importing students.
</commit_message>
<xml_diff>
--- a/docs/Proposals/University Information Dissemination System Propsal.docx
+++ b/docs/Proposals/University Information Dissemination System Propsal.docx
@@ -197,7 +197,15 @@
         <w:ind w:firstLine="576"/>
       </w:pPr>
       <w:r>
-        <w:t>Digital campus portals have created opportunities for institutions to centralize announcements, academic services and self-service activities. A well-designed information dissemination platform can identify users by role, department or programme and deliver content that is relevant to them. It can also preserve the date, sender, audience and status of each communication, thereby improving accountability and institutional record keeping.</w:t>
+        <w:t xml:space="preserve">Digital campus portals have created opportunities for institutions to centralize announcements, academic services and self-service activities. A well-designed information dissemination platform can identify users by role, department or </w:t>
+      </w:r>
+      <w:proofErr w:type="spellStart"/>
+      <w:r>
+        <w:t>programme</w:t>
+      </w:r>
+      <w:proofErr w:type="spellEnd"/>
+      <w:r>
+        <w:t xml:space="preserve"> and deliver content that is relevant to them. It can also preserve the date, sender, audience and status of each communication, thereby improving accountability and institutional record keeping.</w:t>
       </w:r>
     </w:p>
     <w:p>
@@ -278,7 +286,7 @@
         <w:ind w:left="504" w:hanging="288"/>
       </w:pPr>
       <w:r>
-        <w:t>To identify the communication requirements of administrators, lecturers, students and applicants.</w:t>
+        <w:t>To identify the communication requirements of administrators, lecturers, students.</w:t>
       </w:r>
     </w:p>
     <w:p>
@@ -354,8 +362,11 @@
         <w:ind w:firstLine="576"/>
       </w:pPr>
       <w:r>
+        <w:t xml:space="preserve">Modern digital campus systems frequently combine user accounts, dashboards, announcements, messaging and academic self-service tools. Their major advantage is the ability </w:t>
+      </w:r>
+      <w:r>
         <w:lastRenderedPageBreak/>
-        <w:t>Modern digital campus systems frequently combine user accounts, dashboards, announcements, messaging and academic self-service tools. Their major advantage is the ability to connect communication with verified institutional identities and permissions. However, when these services are distributed across unrelated applications, users still experience fragmentation. The proposed project will therefore focus on a single role-aware platform in which communication, identity and selected academic services share a common data model.</w:t>
+        <w:t>to connect communication with verified institutional identities and permissions. However, when these services are distributed across unrelated applications, users still experience fragmentation. The proposed project will therefore focus on a single role-aware platform in which communication, identity and selected academic services share a common data model.</w:t>
       </w:r>
     </w:p>
     <w:p>
@@ -728,7 +739,6 @@
               <w:rPr>
                 <w:sz w:val="22"/>
               </w:rPr>
-              <w:lastRenderedPageBreak/>
               <w:t>System quality</w:t>
             </w:r>
           </w:p>
@@ -783,6 +793,7 @@
     </w:tbl>
     <w:p>
       <w:r>
+        <w:lastRenderedPageBreak/>
         <w:t>The relationship among these concepts is that system quality and information quality influence users' perceptions of usefulness and ease of use. These perceptions are expected to affect user satisfaction and the intention to adopt the proposed platform.</w:t>
       </w:r>
     </w:p>
@@ -938,7 +949,6 @@
         <w:rPr>
           <w:b/>
         </w:rPr>
-        <w:lastRenderedPageBreak/>
         <w:t xml:space="preserve">Testing, evaluation and reporting: </w:t>
       </w:r>
       <w:r>
@@ -947,12 +957,19 @@
     </w:p>
     <w:p>
       <w:pPr>
+        <w:spacing w:after="80"/>
+        <w:ind w:left="288" w:hanging="288"/>
+      </w:pPr>
+    </w:p>
+    <w:p>
+      <w:pPr>
         <w:pStyle w:val="Heading2"/>
       </w:pPr>
       <w:r>
         <w:rPr>
           <w:rFonts w:ascii="Times New Roman" w:eastAsia="Times New Roman" w:hAnsi="Times New Roman"/>
         </w:rPr>
+        <w:lastRenderedPageBreak/>
         <w:t>3.2 Requirements and Data Collection</w:t>
       </w:r>
     </w:p>
@@ -991,88 +1008,19 @@
         <w:rPr>
           <w:rFonts w:ascii="Times New Roman" w:eastAsia="Times New Roman" w:hAnsi="Times New Roman"/>
         </w:rPr>
-        <w:t>3.4 Conceptual and Architectural Framework of the Main System</w:t>
+        <w:t>3.</w:t>
       </w:r>
-    </w:p>
-    <w:p>
-      <w:pPr>
-        <w:ind w:firstLine="576"/>
-      </w:pPr>
-      <w:r>
-        <w:t>The proposed system will use a layered modular architecture. Users will interact with a responsive presentation layer that provides role-specific dashboards. Requests will be handled by the application layer, which will enforce authentication, authorization, validation and business rules. The data and integration layer will manage database operations and external services such as email, SMS and media storage. A relational database will preserve institutional records and the relationships among users, departments, programmes, courses, announcements and transactions.</w:t>
-      </w:r>
-    </w:p>
-    <w:p>
-      <w:pPr>
-        <w:jc w:val="center"/>
-      </w:pPr>
-      <w:r>
-        <w:rPr>
-          <w:noProof/>
-        </w:rPr>
-        <w:lastRenderedPageBreak/>
-        <w:drawing>
-          <wp:inline distT="0" distB="0" distL="0" distR="0" wp14:anchorId="1895625F" wp14:editId="35EB8B43">
-            <wp:extent cx="5669280" cy="3428307"/>
-            <wp:effectExtent l="0" t="0" r="0" b="0"/>
-            <wp:docPr id="3" name="Picture 3"/>
-            <wp:cNvGraphicFramePr>
-              <a:graphicFrameLocks xmlns:a="http://schemas.openxmlformats.org/drawingml/2006/main" noChangeAspect="1"/>
-            </wp:cNvGraphicFramePr>
-            <a:graphic xmlns:a="http://schemas.openxmlformats.org/drawingml/2006/main">
-              <a:graphicData uri="http://schemas.openxmlformats.org/drawingml/2006/picture">
-                <pic:pic xmlns:pic="http://schemas.openxmlformats.org/drawingml/2006/picture">
-                  <pic:nvPicPr>
-                    <pic:cNvPr id="0" name="architecture.png"/>
-                    <pic:cNvPicPr/>
-                  </pic:nvPicPr>
-                  <pic:blipFill>
-                    <a:blip r:embed="rId9"/>
-                    <a:stretch>
-                      <a:fillRect/>
-                    </a:stretch>
-                  </pic:blipFill>
-                  <pic:spPr>
-                    <a:xfrm>
-                      <a:off x="0" y="0"/>
-                      <a:ext cx="5669280" cy="3428307"/>
-                    </a:xfrm>
-                    <a:prstGeom prst="rect">
-                      <a:avLst/>
-                    </a:prstGeom>
-                  </pic:spPr>
-                </pic:pic>
-              </a:graphicData>
-            </a:graphic>
-          </wp:inline>
-        </w:drawing>
-      </w:r>
-    </w:p>
-    <w:p>
-      <w:pPr>
-        <w:pStyle w:val="FigureCaption"/>
-      </w:pPr>
-      <w:r>
-        <w:t>Figure 2: High-level architecture of the proposed system</w:t>
-      </w:r>
-    </w:p>
-    <w:p>
-      <w:pPr>
-        <w:ind w:firstLine="576"/>
-      </w:pPr>
-      <w:r>
-        <w:t>The presentation layer will provide separate views for administrators, department administrators, lecturers, students and applicants. The application layer will contain modules for authentication, announcements, messaging, academic schedules, enrollment and notifications. The data and integration layer will support persistent storage, email and SMS delivery, media uploads and audit information. This separation will make the system easier to test, maintain and extend.</w:t>
-      </w:r>
-    </w:p>
-    <w:p>
-      <w:pPr>
-        <w:pStyle w:val="Heading2"/>
-      </w:pPr>
       <w:r>
         <w:rPr>
           <w:rFonts w:ascii="Times New Roman" w:eastAsia="Times New Roman" w:hAnsi="Times New Roman"/>
         </w:rPr>
-        <w:t>3.5 Proposed Technology Environment</w:t>
+        <w:t>4</w:t>
+      </w:r>
+      <w:r>
+        <w:rPr>
+          <w:rFonts w:ascii="Times New Roman" w:eastAsia="Times New Roman" w:hAnsi="Times New Roman"/>
+        </w:rPr>
+        <w:t xml:space="preserve"> Proposed Technology Environment</w:t>
       </w:r>
     </w:p>
     <w:tbl>
@@ -1356,7 +1304,6 @@
               <w:rPr>
                 <w:sz w:val="22"/>
               </w:rPr>
-              <w:lastRenderedPageBreak/>
               <w:t>Client data and state</w:t>
             </w:r>
           </w:p>
@@ -1379,7 +1326,21 @@
               <w:rPr>
                 <w:sz w:val="22"/>
               </w:rPr>
-              <w:t>React Query, Axios and Zustand where appropriate</w:t>
+              <w:t xml:space="preserve">React Query, Axios and </w:t>
+            </w:r>
+            <w:proofErr w:type="spellStart"/>
+            <w:r>
+              <w:rPr>
+                <w:sz w:val="22"/>
+              </w:rPr>
+              <w:t>Zustand</w:t>
+            </w:r>
+            <w:proofErr w:type="spellEnd"/>
+            <w:r>
+              <w:rPr>
+                <w:sz w:val="22"/>
+              </w:rPr>
+              <w:t xml:space="preserve"> where appropriate</w:t>
             </w:r>
           </w:p>
         </w:tc>
@@ -1540,7 +1501,20 @@
         <w:rPr>
           <w:rFonts w:ascii="Times New Roman" w:eastAsia="Times New Roman" w:hAnsi="Times New Roman"/>
         </w:rPr>
-        <w:t>3.6 Testing and Evaluation Metrics</w:t>
+        <w:lastRenderedPageBreak/>
+        <w:t>3.</w:t>
+      </w:r>
+      <w:r>
+        <w:rPr>
+          <w:rFonts w:ascii="Times New Roman" w:eastAsia="Times New Roman" w:hAnsi="Times New Roman"/>
+        </w:rPr>
+        <w:t>5</w:t>
+      </w:r>
+      <w:r>
+        <w:rPr>
+          <w:rFonts w:ascii="Times New Roman" w:eastAsia="Times New Roman" w:hAnsi="Times New Roman"/>
+        </w:rPr>
+        <w:t xml:space="preserve"> Testing and Evaluation Metrics</w:t>
       </w:r>
     </w:p>
     <w:p>
@@ -2149,7 +2123,6 @@
               <w:rPr>
                 <w:sz w:val="22"/>
               </w:rPr>
-              <w:lastRenderedPageBreak/>
               <w:t>Security and access control</w:t>
             </w:r>
           </w:p>
@@ -2230,7 +2203,19 @@
         <w:rPr>
           <w:rFonts w:ascii="Times New Roman" w:eastAsia="Times New Roman" w:hAnsi="Times New Roman"/>
         </w:rPr>
-        <w:t>3.7 Ethical and Security Considerations</w:t>
+        <w:t>3.</w:t>
+      </w:r>
+      <w:r>
+        <w:rPr>
+          <w:rFonts w:ascii="Times New Roman" w:eastAsia="Times New Roman" w:hAnsi="Times New Roman"/>
+        </w:rPr>
+        <w:t>6</w:t>
+      </w:r>
+      <w:r>
+        <w:rPr>
+          <w:rFonts w:ascii="Times New Roman" w:eastAsia="Times New Roman" w:hAnsi="Times New Roman"/>
+        </w:rPr>
+        <w:t xml:space="preserve"> Ethical and Security Considerations</w:t>
       </w:r>
     </w:p>
     <w:p>
@@ -2249,7 +2234,8 @@
         <w:rPr>
           <w:rFonts w:ascii="Times New Roman" w:eastAsia="Times New Roman" w:hAnsi="Times New Roman"/>
         </w:rPr>
-        <w:t>4.0 CONCLUSION</w:t>
+        <w:lastRenderedPageBreak/>
+        <w:t>CONCLUSION</w:t>
       </w:r>
     </w:p>
     <w:p>
@@ -2301,7 +2287,6 @@
         <w:rPr>
           <w:rFonts w:ascii="Times New Roman" w:eastAsia="Times New Roman" w:hAnsi="Times New Roman"/>
         </w:rPr>
-        <w:lastRenderedPageBreak/>
         <w:t>REFERENCES</w:t>
       </w:r>
     </w:p>
@@ -2355,8 +2340,13 @@
         <w:spacing w:after="80"/>
         <w:ind w:left="720" w:hanging="720"/>
       </w:pPr>
+      <w:proofErr w:type="spellStart"/>
       <w:r>
-        <w:t>Vercel, Inc. (2026). Next.js documentation.</w:t>
+        <w:t>Vercel</w:t>
+      </w:r>
+      <w:proofErr w:type="spellEnd"/>
+      <w:r>
+        <w:t>, Inc. (2026). Next.js documentation.</w:t>
       </w:r>
     </w:p>
     <w:p>
@@ -2369,10 +2359,10 @@
       </w:r>
     </w:p>
     <w:sectPr>
-      <w:headerReference w:type="default" r:id="rId10"/>
-      <w:footerReference w:type="default" r:id="rId11"/>
-      <w:headerReference w:type="first" r:id="rId12"/>
-      <w:footerReference w:type="first" r:id="rId13"/>
+      <w:headerReference w:type="default" r:id="rId9"/>
+      <w:footerReference w:type="default" r:id="rId10"/>
+      <w:headerReference w:type="first" r:id="rId11"/>
+      <w:footerReference w:type="first" r:id="rId12"/>
       <w:pgSz w:w="12240" w:h="15840"/>
       <w:pgMar w:top="1080" w:right="1440" w:bottom="1080" w:left="1440" w:header="720" w:footer="720" w:gutter="0"/>
       <w:cols w:space="720"/>

</xml_diff>